<commit_message>
feat: finalize background email ingestion agent
</commit_message>
<xml_diff>
--- a/data/CLAIM SETTLEMENT LETTER.docx (1).docx
+++ b/data/CLAIM SETTLEMENT LETTER.docx (1).docx
@@ -1,10 +1,16 @@
 
 <file path=word/document.xml><?xml version="1.0" encoding="utf-8"?>
-<w:document xmlns:wpc="http://schemas.microsoft.com/office/word/2010/wordprocessingCanvas" xmlns:mc="http://schemas.openxmlformats.org/markup-compatibility/2006" xmlns:o="urn:schemas-microsoft-com:office:office" xmlns:r="http://schemas.openxmlformats.org/officeDocument/2006/relationships" xmlns:m="http://schemas.openxmlformats.org/officeDocument/2006/math" xmlns:v="urn:schemas-microsoft-com:vml" xmlns:wp14="http://schemas.microsoft.com/office/word/2010/wordprocessingDrawing" xmlns:wp="http://schemas.openxmlformats.org/drawingml/2006/wordprocessingDrawing" xmlns:w10="urn:schemas-microsoft-com:office:word" xmlns:w="http://schemas.openxmlformats.org/wordprocessingml/2006/main" xmlns:w14="http://schemas.microsoft.com/office/word/2010/wordml" xmlns:w15="http://schemas.microsoft.com/office/word/2012/wordml" xmlns:wpg="http://schemas.microsoft.com/office/word/2010/wordprocessingGroup" xmlns:wpi="http://schemas.microsoft.com/office/word/2010/wordprocessingInk" xmlns:wne="http://schemas.microsoft.com/office/word/2006/wordml" xmlns:wps="http://schemas.microsoft.com/office/word/2010/wordprocessingShape" mc:Ignorable="w14 w15 wp14">
+<w:document xmlns:wpc="http://schemas.microsoft.com/office/word/2010/wordprocessingCanvas" xmlns:cx="http://schemas.microsoft.com/office/drawing/2014/chartex" xmlns:cx1="http://schemas.microsoft.com/office/drawing/2015/9/8/chartex" xmlns:cx2="http://schemas.microsoft.com/office/drawing/2015/10/21/chartex" xmlns:cx3="http://schemas.microsoft.com/office/drawing/2016/5/9/chartex" xmlns:cx4="http://schemas.microsoft.com/office/drawing/2016/5/10/chartex" xmlns:cx5="http://schemas.microsoft.com/office/drawing/2016/5/11/chartex" xmlns:cx6="http://schemas.microsoft.com/office/drawing/2016/5/12/chartex" xmlns:cx7="http://schemas.microsoft.com/office/drawing/2016/5/13/chartex" xmlns:cx8="http://schemas.microsoft.com/office/drawing/2016/5/14/chartex" xmlns:mc="http://schemas.openxmlformats.org/markup-compatibility/2006" xmlns:aink="http://schemas.microsoft.com/office/drawing/2016/ink" xmlns:am3d="http://schemas.microsoft.com/office/drawing/2017/model3d" xmlns:o="urn:schemas-microsoft-com:office:office" xmlns:oel="http://schemas.microsoft.com/office/2019/extlst" xmlns:r="http://schemas.openxmlformats.org/officeDocument/2006/relationships" xmlns:m="http://schemas.openxmlformats.org/officeDocument/2006/math" xmlns:v="urn:schemas-microsoft-com:vml" xmlns:wp14="http://schemas.microsoft.com/office/word/2010/wordprocessingDrawing" xmlns:wp="http://schemas.openxmlformats.org/drawingml/2006/wordprocessingDrawing" xmlns:w10="urn:schemas-microsoft-com:office:word" xmlns:w="http://schemas.openxmlformats.org/wordprocessingml/2006/main" xmlns:w14="http://schemas.microsoft.com/office/word/2010/wordml" xmlns:w15="http://schemas.microsoft.com/office/word/2012/wordml" xmlns:w16cex="http://schemas.microsoft.com/office/word/2018/wordml/cex" xmlns:w16cid="http://schemas.microsoft.com/office/word/2016/wordml/cid" xmlns:w16="http://schemas.microsoft.com/office/word/2018/wordml" xmlns:w16du="http://schemas.microsoft.com/office/word/2023/wordml/word16du" xmlns:w16sdtdh="http://schemas.microsoft.com/office/word/2020/wordml/sdtdatahash" xmlns:w16sdtfl="http://schemas.microsoft.com/office/word/2024/wordml/sdtformatlock" xmlns:w16se="http://schemas.microsoft.com/office/word/2015/wordml/symex" xmlns:wpg="http://schemas.microsoft.com/office/word/2010/wordprocessingGroup" xmlns:wpi="http://schemas.microsoft.com/office/word/2010/wordprocessingInk" xmlns:wne="http://schemas.microsoft.com/office/word/2006/wordml" xmlns:wps="http://schemas.microsoft.com/office/word/2010/wordprocessingShape" mc:Ignorable="w14 w15 w16se w16cid w16 w16cex w16sdtdh w16sdtfl w16du wp14">
   <w:body>
     <w:p>
       <w:pPr>
-        <w:spacing w:before="120" w:after="120" w:line="394" w:lineRule="auto"/>
+        <w:rPr>
+          <w:rFonts w:ascii="Aptos" w:eastAsia="Aptos" w:hAnsi="Aptos" w:cs="Aptos"/>
+          <w:color w:val="000000"/>
+          <w:sz w:val="26"/>
+          <w:szCs w:val="26"/>
+          <w:lang w:val="en-IN"/>
+        </w:rPr>
       </w:pPr>
       <w:r>
         <w:rPr>
@@ -12,370 +18,698 @@
           <w:color w:val="000000"/>
           <w:sz w:val="26"/>
           <w:szCs w:val="26"/>
-        </w:rPr>
-        <w:t>CLAIM SETTLEMENT LETTER</w:t>
-      </w:r>
-      <w:r>
-        <w:rPr>
-          <w:rFonts w:ascii="Arimo" w:eastAsia="Arimo" w:hAnsi="Arimo" w:cs="Arimo"/>
-          <w:color w:val="000000"/>
-          <w:sz w:val="28"/>
-          <w:szCs w:val="28"/>
-        </w:rPr>
-        <w:t xml:space="preserve"> </w:t>
+          <w:lang w:val="en-IN"/>
+        </w:rPr>
+        <w:t> </w:t>
       </w:r>
     </w:p>
     <w:p>
       <w:pPr>
-        <w:spacing w:before="120" w:after="120" w:line="394" w:lineRule="auto"/>
+        <w:rPr>
+          <w:rFonts w:ascii="Aptos" w:eastAsia="Aptos" w:hAnsi="Aptos" w:cs="Aptos"/>
+          <w:color w:val="000000"/>
+          <w:sz w:val="26"/>
+          <w:szCs w:val="26"/>
+          <w:lang w:val="en-IN"/>
+        </w:rPr>
       </w:pPr>
       <w:r>
         <w:rPr>
-          <w:rFonts w:ascii="Arimo" w:eastAsia="Arimo" w:hAnsi="Arimo" w:cs="Arimo"/>
-          <w:color w:val="000000"/>
-          <w:sz w:val="28"/>
-          <w:szCs w:val="28"/>
-        </w:rPr>
-        <w:t xml:space="preserve"> </w:t>
+          <w:rFonts w:ascii="Aptos" w:eastAsia="Aptos" w:hAnsi="Aptos" w:cs="Aptos"/>
+          <w:color w:val="000000"/>
+          <w:sz w:val="26"/>
+          <w:szCs w:val="26"/>
+          <w:lang w:val="en-IN"/>
+        </w:rPr>
+        <w:t> </w:t>
       </w:r>
     </w:p>
     <w:p>
       <w:pPr>
-        <w:spacing w:before="120" w:after="120" w:line="394" w:lineRule="auto"/>
+        <w:rPr>
+          <w:rFonts w:ascii="Aptos" w:eastAsia="Aptos" w:hAnsi="Aptos" w:cs="Aptos"/>
+          <w:color w:val="000000"/>
+          <w:sz w:val="26"/>
+          <w:szCs w:val="26"/>
+          <w:lang w:val="en-IN"/>
+        </w:rPr>
       </w:pPr>
       <w:r>
         <w:rPr>
-          <w:rFonts w:ascii="Aptos" w:eastAsia="Aptos" w:hAnsi="Aptos" w:cs="Aptos"/>
-          <w:color w:val="000000"/>
-          <w:sz w:val="26"/>
-          <w:szCs w:val="26"/>
+          <w:rFonts w:ascii="Arial" w:eastAsia="Aptos" w:hAnsi="Arial" w:cs="Arial"/>
+          <w:color w:val="000000"/>
+          <w:sz w:val="26"/>
+          <w:szCs w:val="26"/>
+          <w:lang w:val="en-IN"/>
+        </w:rPr>
+        <w:t>​</w:t>
+      </w:r>
+      <w:r>
+        <w:rPr>
+          <w:rFonts w:ascii="Aptos" w:eastAsia="Aptos" w:hAnsi="Aptos" w:cs="Aptos"/>
+          <w:color w:val="000000"/>
+          <w:sz w:val="26"/>
+          <w:szCs w:val="26"/>
+          <w:lang w:val="en-IN"/>
+        </w:rPr>
+        <w:t>CLAIM SETTLEMENT LETTER </w:t>
+      </w:r>
+      <w:r>
+        <w:rPr>
+          <w:rFonts w:ascii="Aptos" w:eastAsia="Aptos" w:hAnsi="Aptos" w:cs="Aptos"/>
+          <w:color w:val="000000"/>
+          <w:sz w:val="26"/>
+          <w:szCs w:val="26"/>
+          <w:lang w:val="en-IN"/>
+        </w:rPr>
+        <w:br/>
+      </w:r>
+      <w:r>
+        <w:rPr>
+          <w:rFonts w:ascii="Aptos" w:eastAsia="Aptos" w:hAnsi="Aptos" w:cs="Aptos"/>
+          <w:color w:val="000000"/>
+          <w:sz w:val="26"/>
+          <w:szCs w:val="26"/>
+          <w:lang w:val="en-IN"/>
+        </w:rPr>
+        <w:br/>
+      </w:r>
+      <w:r>
+        <w:rPr>
+          <w:rFonts w:ascii="Aptos" w:eastAsia="Aptos" w:hAnsi="Aptos" w:cs="Aptos"/>
+          <w:color w:val="000000"/>
+          <w:sz w:val="26"/>
+          <w:szCs w:val="26"/>
+          <w:lang w:val="en-IN"/>
+        </w:rPr>
+        <w:br/>
+      </w:r>
+      <w:proofErr w:type="gramStart"/>
+      <w:r>
+        <w:rPr>
+          <w:rFonts w:ascii="Aptos" w:eastAsia="Aptos" w:hAnsi="Aptos" w:cs="Aptos"/>
+          <w:color w:val="000000"/>
+          <w:sz w:val="26"/>
+          <w:szCs w:val="26"/>
+          <w:lang w:val="en-IN"/>
+        </w:rPr>
+        <w:t>Date :</w:t>
+      </w:r>
+      <w:proofErr w:type="gramEnd"/>
+      <w:r>
+        <w:rPr>
+          <w:rFonts w:ascii="Aptos" w:eastAsia="Aptos" w:hAnsi="Aptos" w:cs="Aptos"/>
+          <w:color w:val="000000"/>
+          <w:sz w:val="26"/>
+          <w:szCs w:val="26"/>
+          <w:lang w:val="en-IN"/>
+        </w:rPr>
+        <w:t xml:space="preserve"> 0</w:t>
+      </w:r>
+      <w:r>
+        <w:rPr>
+          <w:rFonts w:ascii="Aptos" w:eastAsia="Aptos" w:hAnsi="Aptos" w:cs="Aptos"/>
+          <w:color w:val="000000"/>
+          <w:sz w:val="26"/>
+          <w:szCs w:val="26"/>
+          <w:lang w:val="en-IN"/>
+        </w:rPr>
+        <w:t>4</w:t>
+      </w:r>
+      <w:r>
+        <w:rPr>
+          <w:rFonts w:ascii="Aptos" w:eastAsia="Aptos" w:hAnsi="Aptos" w:cs="Aptos"/>
+          <w:color w:val="000000"/>
+          <w:sz w:val="26"/>
+          <w:szCs w:val="26"/>
+          <w:lang w:val="en-IN"/>
+        </w:rPr>
+        <w:t xml:space="preserve"> July 2026</w:t>
+      </w:r>
+      <w:r>
+        <w:rPr>
+          <w:rFonts w:ascii="Aptos" w:eastAsia="Aptos" w:hAnsi="Aptos" w:cs="Aptos"/>
+          <w:color w:val="000000"/>
+          <w:sz w:val="26"/>
+          <w:szCs w:val="26"/>
+          <w:lang w:val="en-IN"/>
+        </w:rPr>
+        <w:br/>
+        <w:t xml:space="preserve">Claim </w:t>
+      </w:r>
+      <w:proofErr w:type="gramStart"/>
+      <w:r>
+        <w:rPr>
+          <w:rFonts w:ascii="Aptos" w:eastAsia="Aptos" w:hAnsi="Aptos" w:cs="Aptos"/>
+          <w:color w:val="000000"/>
+          <w:sz w:val="26"/>
+          <w:szCs w:val="26"/>
+          <w:lang w:val="en-IN"/>
+        </w:rPr>
+        <w:t>Number :</w:t>
+      </w:r>
+      <w:proofErr w:type="gramEnd"/>
+      <w:r>
+        <w:rPr>
+          <w:rFonts w:ascii="Aptos" w:eastAsia="Aptos" w:hAnsi="Aptos" w:cs="Aptos"/>
+          <w:color w:val="000000"/>
+          <w:sz w:val="26"/>
+          <w:szCs w:val="26"/>
+          <w:lang w:val="en-IN"/>
+        </w:rPr>
+        <w:t xml:space="preserve"> CLM-</w:t>
+      </w:r>
+      <w:r>
+        <w:rPr>
+          <w:rFonts w:ascii="Aptos" w:eastAsia="Aptos" w:hAnsi="Aptos" w:cs="Aptos"/>
+          <w:color w:val="000000"/>
+          <w:sz w:val="26"/>
+          <w:szCs w:val="26"/>
+          <w:lang w:val="en-IN"/>
+        </w:rPr>
+        <w:t>234463-32436</w:t>
+      </w:r>
+      <w:r>
+        <w:rPr>
+          <w:rFonts w:ascii="MS Gothic" w:eastAsia="MS Gothic" w:hAnsi="MS Gothic" w:cs="MS Gothic" w:hint="eastAsia"/>
+          <w:color w:val="000000"/>
+          <w:sz w:val="26"/>
+          <w:szCs w:val="26"/>
+          <w:lang w:val="en-IN"/>
+        </w:rPr>
+        <w:t> +</w:t>
+      </w:r>
+      <w:r>
+        <w:rPr>
+          <w:rFonts w:ascii="Aptos" w:eastAsia="Aptos" w:hAnsi="Aptos" w:cs="Aptos"/>
+          <w:color w:val="000000"/>
+          <w:sz w:val="26"/>
+          <w:szCs w:val="26"/>
+          <w:lang w:val="en-IN"/>
+        </w:rPr>
+        <w:br/>
+        <w:t xml:space="preserve">Policy </w:t>
+      </w:r>
+      <w:proofErr w:type="gramStart"/>
+      <w:r>
+        <w:rPr>
+          <w:rFonts w:ascii="Aptos" w:eastAsia="Aptos" w:hAnsi="Aptos" w:cs="Aptos"/>
+          <w:color w:val="000000"/>
+          <w:sz w:val="26"/>
+          <w:szCs w:val="26"/>
+          <w:lang w:val="en-IN"/>
+        </w:rPr>
+        <w:t>Number :</w:t>
+      </w:r>
+      <w:proofErr w:type="gramEnd"/>
+      <w:r>
+        <w:rPr>
+          <w:rFonts w:ascii="Aptos" w:eastAsia="Aptos" w:hAnsi="Aptos" w:cs="Aptos"/>
+          <w:color w:val="000000"/>
+          <w:sz w:val="26"/>
+          <w:szCs w:val="26"/>
+          <w:lang w:val="en-IN"/>
         </w:rPr>
         <w:t xml:space="preserve"> </w:t>
+      </w:r>
+      <w:r>
+        <w:rPr>
+          <w:rFonts w:ascii="MS Gothic" w:eastAsia="MS Gothic" w:hAnsi="MS Gothic" w:cs="MS Gothic" w:hint="eastAsia"/>
+          <w:color w:val="000000"/>
+          <w:sz w:val="26"/>
+          <w:szCs w:val="26"/>
+          <w:lang w:val="en-IN"/>
+        </w:rPr>
+        <w:t> +</w:t>
+      </w:r>
+      <w:r>
+        <w:rPr>
+          <w:rFonts w:ascii="Aptos" w:eastAsia="Aptos" w:hAnsi="Aptos" w:cs="Aptos"/>
+          <w:color w:val="000000"/>
+          <w:sz w:val="26"/>
+          <w:szCs w:val="26"/>
+          <w:lang w:val="en-IN"/>
+        </w:rPr>
+        <w:t>1323135</w:t>
+      </w:r>
+      <w:r>
+        <w:rPr>
+          <w:rFonts w:ascii="Aptos" w:eastAsia="Aptos" w:hAnsi="Aptos" w:cs="Aptos"/>
+          <w:color w:val="000000"/>
+          <w:sz w:val="26"/>
+          <w:szCs w:val="26"/>
+          <w:lang w:val="en-IN"/>
+        </w:rPr>
+        <w:br/>
+        <w:t xml:space="preserve">Insured </w:t>
+      </w:r>
+      <w:proofErr w:type="gramStart"/>
+      <w:r>
+        <w:rPr>
+          <w:rFonts w:ascii="Aptos" w:eastAsia="Aptos" w:hAnsi="Aptos" w:cs="Aptos"/>
+          <w:color w:val="000000"/>
+          <w:sz w:val="26"/>
+          <w:szCs w:val="26"/>
+          <w:lang w:val="en-IN"/>
+        </w:rPr>
+        <w:t>Name :</w:t>
+      </w:r>
+      <w:proofErr w:type="gramEnd"/>
+      <w:r>
+        <w:rPr>
+          <w:rFonts w:ascii="Aptos" w:eastAsia="Aptos" w:hAnsi="Aptos" w:cs="Aptos"/>
+          <w:color w:val="000000"/>
+          <w:sz w:val="26"/>
+          <w:szCs w:val="26"/>
+          <w:lang w:val="en-IN"/>
+        </w:rPr>
+        <w:t xml:space="preserve"> </w:t>
+      </w:r>
+      <w:r>
+        <w:rPr>
+          <w:rFonts w:ascii="MS Gothic" w:eastAsia="MS Gothic" w:hAnsi="MS Gothic" w:cs="MS Gothic" w:hint="eastAsia"/>
+          <w:color w:val="000000"/>
+          <w:sz w:val="26"/>
+          <w:szCs w:val="26"/>
+          <w:lang w:val="en-IN"/>
+        </w:rPr>
+        <w:t> +</w:t>
+      </w:r>
+      <w:r>
+        <w:rPr>
+          <w:rFonts w:ascii="Aptos" w:eastAsia="Aptos" w:hAnsi="Aptos" w:cs="Aptos"/>
+          <w:color w:val="000000"/>
+          <w:sz w:val="26"/>
+          <w:szCs w:val="26"/>
+          <w:lang w:val="en-IN"/>
+        </w:rPr>
+        <w:t>Bob Adro</w:t>
+      </w:r>
+      <w:r>
+        <w:rPr>
+          <w:rFonts w:ascii="Aptos" w:eastAsia="Aptos" w:hAnsi="Aptos" w:cs="Aptos"/>
+          <w:color w:val="000000"/>
+          <w:sz w:val="26"/>
+          <w:szCs w:val="26"/>
+          <w:lang w:val="en-IN"/>
+        </w:rPr>
+        <w:t xml:space="preserve"> </w:t>
+      </w:r>
+      <w:r>
+        <w:rPr>
+          <w:rFonts w:ascii="Aptos" w:eastAsia="Aptos" w:hAnsi="Aptos" w:cs="Aptos"/>
+          <w:color w:val="000000"/>
+          <w:sz w:val="26"/>
+          <w:szCs w:val="26"/>
+          <w:lang w:val="en-IN"/>
+        </w:rPr>
+        <w:br/>
+        <w:t xml:space="preserve">Property </w:t>
+      </w:r>
+      <w:proofErr w:type="gramStart"/>
+      <w:r>
+        <w:rPr>
+          <w:rFonts w:ascii="Aptos" w:eastAsia="Aptos" w:hAnsi="Aptos" w:cs="Aptos"/>
+          <w:color w:val="000000"/>
+          <w:sz w:val="26"/>
+          <w:szCs w:val="26"/>
+          <w:lang w:val="en-IN"/>
+        </w:rPr>
+        <w:t>Address :</w:t>
+      </w:r>
+      <w:proofErr w:type="gramEnd"/>
+      <w:r>
+        <w:rPr>
+          <w:rFonts w:ascii="Aptos" w:eastAsia="Aptos" w:hAnsi="Aptos" w:cs="Aptos"/>
+          <w:color w:val="000000"/>
+          <w:sz w:val="26"/>
+          <w:szCs w:val="26"/>
+          <w:lang w:val="en-IN"/>
+        </w:rPr>
+        <w:t xml:space="preserve"> 75, Satellite Road, Ahmedabad - 380015 </w:t>
+      </w:r>
+      <w:r>
+        <w:rPr>
+          <w:rFonts w:ascii="Aptos" w:eastAsia="Aptos" w:hAnsi="Aptos" w:cs="Aptos"/>
+          <w:color w:val="000000"/>
+          <w:sz w:val="26"/>
+          <w:szCs w:val="26"/>
+          <w:lang w:val="en-IN"/>
+        </w:rPr>
+        <w:br/>
+        <w:t xml:space="preserve">Dear </w:t>
+      </w:r>
+      <w:r>
+        <w:rPr>
+          <w:rFonts w:ascii="Aptos" w:eastAsia="Aptos" w:hAnsi="Aptos" w:cs="Aptos"/>
+          <w:color w:val="000000"/>
+          <w:sz w:val="26"/>
+          <w:szCs w:val="26"/>
+          <w:lang w:val="en-IN"/>
+        </w:rPr>
+        <w:t>Bob Adro</w:t>
+      </w:r>
+      <w:r>
+        <w:rPr>
+          <w:rFonts w:ascii="Aptos" w:eastAsia="Aptos" w:hAnsi="Aptos" w:cs="Aptos"/>
+          <w:color w:val="000000"/>
+          <w:sz w:val="26"/>
+          <w:szCs w:val="26"/>
+          <w:lang w:val="en-IN"/>
+        </w:rPr>
+        <w:t>, </w:t>
+      </w:r>
+      <w:r>
+        <w:rPr>
+          <w:rFonts w:ascii="Aptos" w:eastAsia="Aptos" w:hAnsi="Aptos" w:cs="Aptos"/>
+          <w:color w:val="000000"/>
+          <w:sz w:val="26"/>
+          <w:szCs w:val="26"/>
+          <w:lang w:val="en-IN"/>
+        </w:rPr>
+        <w:br/>
+        <w:t>We are pleased to inform you that your claim for</w:t>
+      </w:r>
+      <w:r>
+        <w:rPr>
+          <w:rFonts w:ascii="MS Gothic" w:eastAsia="MS Gothic" w:hAnsi="MS Gothic" w:cs="MS Gothic" w:hint="eastAsia"/>
+          <w:color w:val="000000"/>
+          <w:sz w:val="26"/>
+          <w:szCs w:val="26"/>
+          <w:lang w:val="en-IN"/>
+        </w:rPr>
+        <w:t> +</w:t>
+      </w:r>
+      <w:r>
+        <w:rPr>
+          <w:rFonts w:ascii="Aptos" w:eastAsia="Aptos" w:hAnsi="Aptos" w:cs="Aptos"/>
+          <w:color w:val="000000"/>
+          <w:sz w:val="26"/>
+          <w:szCs w:val="26"/>
+          <w:lang w:val="en-IN"/>
+        </w:rPr>
+        <w:br/>
+        <w:t>storm-related roof damage, reported on 14 June 2026,</w:t>
+      </w:r>
+      <w:r>
+        <w:rPr>
+          <w:rFonts w:ascii="MS Gothic" w:eastAsia="MS Gothic" w:hAnsi="MS Gothic" w:cs="MS Gothic" w:hint="eastAsia"/>
+          <w:color w:val="000000"/>
+          <w:sz w:val="26"/>
+          <w:szCs w:val="26"/>
+          <w:lang w:val="en-IN"/>
+        </w:rPr>
+        <w:t> +</w:t>
+      </w:r>
+      <w:r>
+        <w:rPr>
+          <w:rFonts w:ascii="Aptos" w:eastAsia="Aptos" w:hAnsi="Aptos" w:cs="Aptos"/>
+          <w:color w:val="000000"/>
+          <w:sz w:val="26"/>
+          <w:szCs w:val="26"/>
+          <w:lang w:val="en-IN"/>
+        </w:rPr>
+        <w:br/>
+        <w:t>has been assessed and approved for settlement. </w:t>
+      </w:r>
+      <w:r>
+        <w:rPr>
+          <w:rFonts w:ascii="Aptos" w:eastAsia="Aptos" w:hAnsi="Aptos" w:cs="Aptos"/>
+          <w:color w:val="000000"/>
+          <w:sz w:val="26"/>
+          <w:szCs w:val="26"/>
+          <w:lang w:val="en-IN"/>
+        </w:rPr>
+        <w:br/>
+        <w:t xml:space="preserve">Approved Claim </w:t>
+      </w:r>
+      <w:proofErr w:type="gramStart"/>
+      <w:r>
+        <w:rPr>
+          <w:rFonts w:ascii="Aptos" w:eastAsia="Aptos" w:hAnsi="Aptos" w:cs="Aptos"/>
+          <w:color w:val="000000"/>
+          <w:sz w:val="26"/>
+          <w:szCs w:val="26"/>
+          <w:lang w:val="en-IN"/>
+        </w:rPr>
+        <w:t>Amount :</w:t>
+      </w:r>
+      <w:proofErr w:type="gramEnd"/>
+      <w:r>
+        <w:rPr>
+          <w:rFonts w:ascii="Aptos" w:eastAsia="Aptos" w:hAnsi="Aptos" w:cs="Aptos"/>
+          <w:color w:val="000000"/>
+          <w:sz w:val="26"/>
+          <w:szCs w:val="26"/>
+          <w:lang w:val="en-IN"/>
+        </w:rPr>
+        <w:t xml:space="preserve"> ₹10,42,00</w:t>
+      </w:r>
+      <w:r>
+        <w:rPr>
+          <w:rFonts w:ascii="MS Gothic" w:eastAsia="MS Gothic" w:hAnsi="MS Gothic" w:cs="MS Gothic" w:hint="eastAsia"/>
+          <w:color w:val="000000"/>
+          <w:sz w:val="26"/>
+          <w:szCs w:val="26"/>
+          <w:lang w:val="en-IN"/>
+        </w:rPr>
+        <w:t> +</w:t>
+      </w:r>
+      <w:r>
+        <w:rPr>
+          <w:rFonts w:ascii="Aptos" w:eastAsia="Aptos" w:hAnsi="Aptos" w:cs="Aptos"/>
+          <w:color w:val="000000"/>
+          <w:sz w:val="26"/>
+          <w:szCs w:val="26"/>
+          <w:lang w:val="en-IN"/>
+        </w:rPr>
+        <w:br/>
+        <w:t xml:space="preserve">Deductible </w:t>
+      </w:r>
+      <w:proofErr w:type="gramStart"/>
+      <w:r>
+        <w:rPr>
+          <w:rFonts w:ascii="Aptos" w:eastAsia="Aptos" w:hAnsi="Aptos" w:cs="Aptos"/>
+          <w:color w:val="000000"/>
+          <w:sz w:val="26"/>
+          <w:szCs w:val="26"/>
+          <w:lang w:val="en-IN"/>
+        </w:rPr>
+        <w:t>Applied :</w:t>
+      </w:r>
+      <w:proofErr w:type="gramEnd"/>
+      <w:r>
+        <w:rPr>
+          <w:rFonts w:ascii="Aptos" w:eastAsia="Aptos" w:hAnsi="Aptos" w:cs="Aptos"/>
+          <w:color w:val="000000"/>
+          <w:sz w:val="26"/>
+          <w:szCs w:val="26"/>
+          <w:lang w:val="en-IN"/>
+        </w:rPr>
+        <w:t xml:space="preserve"> ₹20,00</w:t>
+      </w:r>
+      <w:r>
+        <w:rPr>
+          <w:rFonts w:ascii="Aptos" w:eastAsia="Aptos" w:hAnsi="Aptos" w:cs="Aptos"/>
+          <w:color w:val="000000"/>
+          <w:sz w:val="26"/>
+          <w:szCs w:val="26"/>
+          <w:lang w:val="en-IN"/>
+        </w:rPr>
+        <w:t>0</w:t>
+      </w:r>
+      <w:r>
+        <w:rPr>
+          <w:rFonts w:ascii="MS Gothic" w:eastAsia="MS Gothic" w:hAnsi="MS Gothic" w:cs="MS Gothic" w:hint="eastAsia"/>
+          <w:color w:val="000000"/>
+          <w:sz w:val="26"/>
+          <w:szCs w:val="26"/>
+          <w:lang w:val="en-IN"/>
+        </w:rPr>
+        <w:t> +</w:t>
+      </w:r>
+      <w:r>
+        <w:rPr>
+          <w:rFonts w:ascii="Aptos" w:eastAsia="Aptos" w:hAnsi="Aptos" w:cs="Aptos"/>
+          <w:color w:val="000000"/>
+          <w:sz w:val="26"/>
+          <w:szCs w:val="26"/>
+          <w:lang w:val="en-IN"/>
+        </w:rPr>
+        <w:br/>
+        <w:t xml:space="preserve">Net Settlement </w:t>
+      </w:r>
+      <w:proofErr w:type="gramStart"/>
+      <w:r>
+        <w:rPr>
+          <w:rFonts w:ascii="Aptos" w:eastAsia="Aptos" w:hAnsi="Aptos" w:cs="Aptos"/>
+          <w:color w:val="000000"/>
+          <w:sz w:val="26"/>
+          <w:szCs w:val="26"/>
+          <w:lang w:val="en-IN"/>
+        </w:rPr>
+        <w:t>Amount :</w:t>
+      </w:r>
+      <w:proofErr w:type="gramEnd"/>
+      <w:r>
+        <w:rPr>
+          <w:rFonts w:ascii="Aptos" w:eastAsia="Aptos" w:hAnsi="Aptos" w:cs="Aptos"/>
+          <w:color w:val="000000"/>
+          <w:sz w:val="26"/>
+          <w:szCs w:val="26"/>
+          <w:lang w:val="en-IN"/>
+        </w:rPr>
+        <w:t xml:space="preserve"> ₹10,22,00</w:t>
+      </w:r>
+      <w:r>
+        <w:rPr>
+          <w:rFonts w:ascii="Aptos" w:eastAsia="Aptos" w:hAnsi="Aptos" w:cs="Aptos"/>
+          <w:color w:val="000000"/>
+          <w:sz w:val="26"/>
+          <w:szCs w:val="26"/>
+          <w:lang w:val="en-IN"/>
+        </w:rPr>
+        <w:br/>
+        <w:t>Payment will be credited to your registered bank</w:t>
+      </w:r>
+      <w:r>
+        <w:rPr>
+          <w:rFonts w:ascii="MS Gothic" w:eastAsia="MS Gothic" w:hAnsi="MS Gothic" w:cs="MS Gothic" w:hint="eastAsia"/>
+          <w:color w:val="000000"/>
+          <w:sz w:val="26"/>
+          <w:szCs w:val="26"/>
+          <w:lang w:val="en-IN"/>
+        </w:rPr>
+        <w:t> +</w:t>
+      </w:r>
+      <w:r>
+        <w:rPr>
+          <w:rFonts w:ascii="Aptos" w:eastAsia="Aptos" w:hAnsi="Aptos" w:cs="Aptos"/>
+          <w:color w:val="000000"/>
+          <w:sz w:val="26"/>
+          <w:szCs w:val="26"/>
+          <w:lang w:val="en-IN"/>
+        </w:rPr>
+        <w:br/>
+        <w:t>account within 5 working days. </w:t>
+      </w:r>
+      <w:r>
+        <w:rPr>
+          <w:rFonts w:ascii="Aptos" w:eastAsia="Aptos" w:hAnsi="Aptos" w:cs="Aptos"/>
+          <w:color w:val="000000"/>
+          <w:sz w:val="26"/>
+          <w:szCs w:val="26"/>
+          <w:lang w:val="en-IN"/>
+        </w:rPr>
+        <w:br/>
+        <w:t>Regards,</w:t>
+      </w:r>
+      <w:r>
+        <w:rPr>
+          <w:rFonts w:ascii="MS Gothic" w:eastAsia="MS Gothic" w:hAnsi="MS Gothic" w:cs="MS Gothic" w:hint="eastAsia"/>
+          <w:color w:val="000000"/>
+          <w:sz w:val="26"/>
+          <w:szCs w:val="26"/>
+          <w:lang w:val="en-IN"/>
+        </w:rPr>
+        <w:t> +</w:t>
+      </w:r>
+      <w:r>
+        <w:rPr>
+          <w:rFonts w:ascii="Aptos" w:eastAsia="Aptos" w:hAnsi="Aptos" w:cs="Aptos"/>
+          <w:color w:val="000000"/>
+          <w:sz w:val="26"/>
+          <w:szCs w:val="26"/>
+          <w:lang w:val="en-IN"/>
+        </w:rPr>
+        <w:br/>
+        <w:t>Claims Settlement Team</w:t>
+      </w:r>
+      <w:r>
+        <w:rPr>
+          <w:rFonts w:ascii="MS Gothic" w:eastAsia="MS Gothic" w:hAnsi="MS Gothic" w:cs="MS Gothic" w:hint="eastAsia"/>
+          <w:color w:val="000000"/>
+          <w:sz w:val="26"/>
+          <w:szCs w:val="26"/>
+          <w:lang w:val="en-IN"/>
+        </w:rPr>
+        <w:t> +</w:t>
+      </w:r>
+      <w:r>
+        <w:rPr>
+          <w:rFonts w:ascii="Aptos" w:eastAsia="Aptos" w:hAnsi="Aptos" w:cs="Aptos"/>
+          <w:color w:val="000000"/>
+          <w:sz w:val="26"/>
+          <w:szCs w:val="26"/>
+          <w:lang w:val="en-IN"/>
+        </w:rPr>
+        <w:br/>
+        <w:t>XYZ Property Insurance Ltd </w:t>
+      </w:r>
+      <w:r>
+        <w:rPr>
+          <w:rFonts w:ascii="Aptos" w:eastAsia="Aptos" w:hAnsi="Aptos" w:cs="Aptos"/>
+          <w:color w:val="000000"/>
+          <w:sz w:val="26"/>
+          <w:szCs w:val="26"/>
+          <w:lang w:val="en-IN"/>
+        </w:rPr>
+        <w:br/>
+      </w:r>
+      <w:r>
+        <w:rPr>
+          <w:rFonts w:ascii="Aptos" w:eastAsia="Aptos" w:hAnsi="Aptos" w:cs="Aptos"/>
+          <w:color w:val="000000"/>
+          <w:sz w:val="26"/>
+          <w:szCs w:val="26"/>
+          <w:lang w:val="en-IN"/>
+        </w:rPr>
+        <w:br/>
+      </w:r>
+      <w:r>
+        <w:rPr>
+          <w:rFonts w:ascii="Aptos" w:eastAsia="Aptos" w:hAnsi="Aptos" w:cs="Aptos"/>
+          <w:color w:val="000000"/>
+          <w:sz w:val="26"/>
+          <w:szCs w:val="26"/>
+          <w:lang w:val="en-IN"/>
+        </w:rPr>
+        <w:br/>
+        <w:t> </w:t>
       </w:r>
     </w:p>
     <w:p>
       <w:pPr>
-        <w:spacing w:before="120" w:after="120" w:line="394" w:lineRule="auto"/>
+        <w:rPr>
+          <w:rFonts w:ascii="Aptos" w:eastAsia="Aptos" w:hAnsi="Aptos" w:cs="Aptos"/>
+          <w:color w:val="000000"/>
+          <w:sz w:val="26"/>
+          <w:szCs w:val="26"/>
+          <w:lang w:val="en-IN"/>
+        </w:rPr>
       </w:pPr>
-      <w:proofErr w:type="gramStart"/>
-      <w:r>
-        <w:rPr>
-          <w:rFonts w:ascii="Aptos" w:eastAsia="Aptos" w:hAnsi="Aptos" w:cs="Aptos"/>
-          <w:color w:val="000000"/>
-          <w:sz w:val="26"/>
-          <w:szCs w:val="26"/>
-        </w:rPr>
-        <w:t>Date :</w:t>
-      </w:r>
-      <w:proofErr w:type="gramEnd"/>
-      <w:r>
-        <w:rPr>
-          <w:rFonts w:ascii="Aptos" w:eastAsia="Aptos" w:hAnsi="Aptos" w:cs="Aptos"/>
-          <w:color w:val="000000"/>
-          <w:sz w:val="26"/>
-          <w:szCs w:val="26"/>
-        </w:rPr>
-        <w:t xml:space="preserve"> </w:t>
-      </w:r>
-      <w:r>
-        <w:rPr>
-          <w:rFonts w:ascii="Aptos" w:eastAsia="Aptos" w:hAnsi="Aptos" w:cs="Aptos"/>
-          <w:color w:val="000000"/>
-          <w:sz w:val="26"/>
-          <w:szCs w:val="26"/>
-        </w:rPr>
-        <w:br/>
-        <w:t xml:space="preserve"> Claim Number : CLM-2026-01278 -</w:t>
-      </w:r>
-      <w:r>
-        <w:rPr>
-          <w:rFonts w:ascii="Aptos" w:eastAsia="Aptos" w:hAnsi="Aptos" w:cs="Aptos"/>
-          <w:color w:val="000000"/>
-          <w:sz w:val="26"/>
-          <w:szCs w:val="26"/>
-        </w:rPr>
-        <w:br/>
-        <w:t xml:space="preserve"> Policy Number : </w:t>
-      </w:r>
-      <w:r>
-        <w:rPr>
-          <w:rFonts w:ascii="Aptos" w:eastAsia="Aptos" w:hAnsi="Aptos" w:cs="Aptos"/>
-          <w:color w:val="000000"/>
-          <w:sz w:val="26"/>
-          <w:szCs w:val="26"/>
-        </w:rPr>
-        <w:t> -</w:t>
-      </w:r>
-      <w:bookmarkStart w:id="0" w:name="_GoBack"/>
-      <w:bookmarkEnd w:id="0"/>
-      <w:r>
-        <w:rPr>
-          <w:rFonts w:ascii="Aptos" w:eastAsia="Aptos" w:hAnsi="Aptos" w:cs="Aptos"/>
-          <w:color w:val="000000"/>
-          <w:sz w:val="26"/>
-          <w:szCs w:val="26"/>
-        </w:rPr>
-        <w:br/>
-        <w:t xml:space="preserve"> Insured Name : </w:t>
-      </w:r>
-      <w:r>
-        <w:rPr>
-          <w:rFonts w:ascii="Aptos" w:eastAsia="Aptos" w:hAnsi="Aptos" w:cs="Aptos"/>
-          <w:color w:val="000000"/>
-          <w:sz w:val="26"/>
-          <w:szCs w:val="26"/>
-        </w:rPr>
-        <w:t> -</w:t>
-      </w:r>
-      <w:r>
-        <w:rPr>
-          <w:rFonts w:ascii="Aptos" w:eastAsia="Aptos" w:hAnsi="Aptos" w:cs="Aptos"/>
-          <w:color w:val="000000"/>
-          <w:sz w:val="26"/>
-          <w:szCs w:val="26"/>
-        </w:rPr>
-        <w:br/>
-        <w:t xml:space="preserve"> Property Address : 75, Satellite Road, Ahmedabad - 380015 </w:t>
+      <w:r>
+        <w:rPr>
+          <w:rFonts w:ascii="Aptos" w:eastAsia="Aptos" w:hAnsi="Aptos" w:cs="Aptos"/>
+          <w:color w:val="000000"/>
+          <w:sz w:val="26"/>
+          <w:szCs w:val="26"/>
+          <w:lang w:val="en-IN"/>
+        </w:rPr>
+        <w:t> </w:t>
       </w:r>
     </w:p>
-    <w:p>
-      <w:pPr>
-        <w:spacing w:before="120" w:after="120" w:line="394" w:lineRule="auto"/>
-      </w:pPr>
-      <w:r>
-        <w:rPr>
-          <w:rFonts w:ascii="Aptos" w:eastAsia="Aptos" w:hAnsi="Aptos" w:cs="Aptos"/>
-          <w:color w:val="000000"/>
-          <w:sz w:val="26"/>
-          <w:szCs w:val="26"/>
-        </w:rPr>
-        <w:t xml:space="preserve">Dear </w:t>
-      </w:r>
-      <w:proofErr w:type="spellStart"/>
-      <w:r>
-        <w:rPr>
-          <w:rFonts w:ascii="Aptos" w:eastAsia="Aptos" w:hAnsi="Aptos" w:cs="Aptos"/>
-          <w:color w:val="000000"/>
-          <w:sz w:val="26"/>
-          <w:szCs w:val="26"/>
-        </w:rPr>
-        <w:t>Priya</w:t>
-      </w:r>
-      <w:proofErr w:type="spellEnd"/>
-      <w:r>
-        <w:rPr>
-          <w:rFonts w:ascii="Aptos" w:eastAsia="Aptos" w:hAnsi="Aptos" w:cs="Aptos"/>
-          <w:color w:val="000000"/>
-          <w:sz w:val="26"/>
-          <w:szCs w:val="26"/>
-        </w:rPr>
-        <w:t xml:space="preserve"> Mehta, </w:t>
-      </w:r>
-    </w:p>
-    <w:p>
-      <w:pPr>
-        <w:spacing w:before="120" w:after="120" w:line="394" w:lineRule="auto"/>
-      </w:pPr>
-      <w:r>
-        <w:rPr>
-          <w:rFonts w:ascii="Aptos" w:eastAsia="Aptos" w:hAnsi="Aptos" w:cs="Aptos"/>
-          <w:color w:val="000000"/>
-          <w:sz w:val="26"/>
-          <w:szCs w:val="26"/>
-        </w:rPr>
-        <w:t>We are pleased to inform you that your claim for -</w:t>
-      </w:r>
-      <w:r>
-        <w:rPr>
-          <w:rFonts w:ascii="Aptos" w:eastAsia="Aptos" w:hAnsi="Aptos" w:cs="Aptos"/>
-          <w:color w:val="000000"/>
-          <w:sz w:val="26"/>
-          <w:szCs w:val="26"/>
-        </w:rPr>
-        <w:br/>
-        <w:t xml:space="preserve"> storm-related roof damage, reported on 14 June 2026</w:t>
-      </w:r>
-      <w:proofErr w:type="gramStart"/>
-      <w:r>
-        <w:rPr>
-          <w:rFonts w:ascii="Aptos" w:eastAsia="Aptos" w:hAnsi="Aptos" w:cs="Aptos"/>
-          <w:color w:val="000000"/>
-          <w:sz w:val="26"/>
-          <w:szCs w:val="26"/>
-        </w:rPr>
-        <w:t>, -</w:t>
-      </w:r>
-      <w:proofErr w:type="gramEnd"/>
-      <w:r>
-        <w:rPr>
-          <w:rFonts w:ascii="Aptos" w:eastAsia="Aptos" w:hAnsi="Aptos" w:cs="Aptos"/>
-          <w:color w:val="000000"/>
-          <w:sz w:val="26"/>
-          <w:szCs w:val="26"/>
-        </w:rPr>
-        <w:br/>
-        <w:t xml:space="preserve"> has been assessed and approved for settlement. </w:t>
-      </w:r>
-    </w:p>
-    <w:p>
-      <w:pPr>
-        <w:spacing w:before="120" w:after="120" w:line="394" w:lineRule="auto"/>
-      </w:pPr>
-      <w:r>
-        <w:rPr>
-          <w:rFonts w:ascii="Aptos" w:eastAsia="Aptos" w:hAnsi="Aptos" w:cs="Aptos"/>
-          <w:color w:val="000000"/>
-          <w:sz w:val="26"/>
-          <w:szCs w:val="26"/>
-        </w:rPr>
-        <w:t xml:space="preserve">Approved Claim </w:t>
-      </w:r>
-      <w:proofErr w:type="gramStart"/>
-      <w:r>
-        <w:rPr>
-          <w:rFonts w:ascii="Aptos" w:eastAsia="Aptos" w:hAnsi="Aptos" w:cs="Aptos"/>
-          <w:color w:val="000000"/>
-          <w:sz w:val="26"/>
-          <w:szCs w:val="26"/>
-        </w:rPr>
-        <w:t>Amount :</w:t>
-      </w:r>
-      <w:proofErr w:type="gramEnd"/>
-      <w:r>
-        <w:rPr>
-          <w:rFonts w:ascii="Aptos" w:eastAsia="Aptos" w:hAnsi="Aptos" w:cs="Aptos"/>
-          <w:color w:val="000000"/>
-          <w:sz w:val="26"/>
-          <w:szCs w:val="26"/>
-        </w:rPr>
-        <w:t xml:space="preserve"> ₹3,42,000 -</w:t>
-      </w:r>
-      <w:r>
-        <w:rPr>
-          <w:rFonts w:ascii="Aptos" w:eastAsia="Aptos" w:hAnsi="Aptos" w:cs="Aptos"/>
-          <w:color w:val="000000"/>
-          <w:sz w:val="26"/>
-          <w:szCs w:val="26"/>
-        </w:rPr>
-        <w:br/>
-        <w:t xml:space="preserve"> Deductible Applied : ₹20,000 -</w:t>
-      </w:r>
-      <w:r>
-        <w:rPr>
-          <w:rFonts w:ascii="Aptos" w:eastAsia="Aptos" w:hAnsi="Aptos" w:cs="Aptos"/>
-          <w:color w:val="000000"/>
-          <w:sz w:val="26"/>
-          <w:szCs w:val="26"/>
-        </w:rPr>
-        <w:br/>
-        <w:t xml:space="preserve"> Net Settlement Amount : ₹3,22,000 </w:t>
-      </w:r>
-    </w:p>
-    <w:p>
-      <w:pPr>
-        <w:spacing w:before="120" w:after="120" w:line="394" w:lineRule="auto"/>
-      </w:pPr>
-      <w:r>
-        <w:rPr>
-          <w:rFonts w:ascii="Aptos" w:eastAsia="Aptos" w:hAnsi="Aptos" w:cs="Aptos"/>
-          <w:color w:val="000000"/>
-          <w:sz w:val="26"/>
-          <w:szCs w:val="26"/>
-        </w:rPr>
-        <w:t>Payment will be credited to your registered bank -</w:t>
-      </w:r>
-      <w:r>
-        <w:rPr>
-          <w:rFonts w:ascii="Aptos" w:eastAsia="Aptos" w:hAnsi="Aptos" w:cs="Aptos"/>
-          <w:color w:val="000000"/>
-          <w:sz w:val="26"/>
-          <w:szCs w:val="26"/>
-        </w:rPr>
-        <w:br/>
-        <w:t xml:space="preserve"> account within 5 working days. </w:t>
-      </w:r>
-    </w:p>
-    <w:p>
-      <w:pPr>
-        <w:spacing w:before="120" w:after="120" w:line="394" w:lineRule="auto"/>
-      </w:pPr>
-      <w:r>
-        <w:rPr>
-          <w:rFonts w:ascii="Aptos" w:eastAsia="Aptos" w:hAnsi="Aptos" w:cs="Aptos"/>
-          <w:color w:val="000000"/>
-          <w:sz w:val="26"/>
-          <w:szCs w:val="26"/>
-        </w:rPr>
-        <w:t>Regards</w:t>
-      </w:r>
-      <w:proofErr w:type="gramStart"/>
-      <w:r>
-        <w:rPr>
-          <w:rFonts w:ascii="Aptos" w:eastAsia="Aptos" w:hAnsi="Aptos" w:cs="Aptos"/>
-          <w:color w:val="000000"/>
-          <w:sz w:val="26"/>
-          <w:szCs w:val="26"/>
-        </w:rPr>
-        <w:t>, -</w:t>
-      </w:r>
-      <w:proofErr w:type="gramEnd"/>
-      <w:r>
-        <w:rPr>
-          <w:rFonts w:ascii="Aptos" w:eastAsia="Aptos" w:hAnsi="Aptos" w:cs="Aptos"/>
-          <w:color w:val="000000"/>
-          <w:sz w:val="26"/>
-          <w:szCs w:val="26"/>
-        </w:rPr>
-        <w:br/>
-        <w:t xml:space="preserve"> Claims Settlement Team -</w:t>
-      </w:r>
-      <w:r>
-        <w:rPr>
-          <w:rFonts w:ascii="Aptos" w:eastAsia="Aptos" w:hAnsi="Aptos" w:cs="Aptos"/>
-          <w:color w:val="000000"/>
-          <w:sz w:val="26"/>
-          <w:szCs w:val="26"/>
-        </w:rPr>
-        <w:br/>
-        <w:t xml:space="preserve"> XYZ Property Insurance Ltd </w:t>
-      </w:r>
-    </w:p>
-    <w:p>
-      <w:pPr>
-        <w:spacing w:before="120" w:after="120" w:line="278" w:lineRule="auto"/>
-      </w:pPr>
-      <w:r>
-        <w:rPr>
-          <w:rFonts w:ascii="Aptos" w:eastAsia="Aptos" w:hAnsi="Aptos" w:cs="Aptos"/>
-          <w:color w:val="000000"/>
-        </w:rPr>
-        <w:t xml:space="preserve"> </w:t>
-      </w:r>
-    </w:p>
-    <w:p>
-      <w:pPr>
-        <w:spacing w:before="120" w:after="120" w:line="278" w:lineRule="auto"/>
-      </w:pPr>
-      <w:r>
-        <w:rPr>
-          <w:rFonts w:ascii="Arimo" w:eastAsia="Arimo" w:hAnsi="Arimo" w:cs="Arimo"/>
-          <w:color w:val="000000"/>
-          <w:sz w:val="24"/>
-          <w:szCs w:val="24"/>
-        </w:rPr>
-        <w:t xml:space="preserve"> </w:t>
-      </w:r>
-    </w:p>
+    <w:p/>
     <w:sectPr>
       <w:pgSz w:w="11910" w:h="16845"/>
       <w:pgMar w:top="1440" w:right="1440" w:bottom="1440" w:left="1440" w:header="720" w:footer="720" w:gutter="0"/>
@@ -386,7 +720,7 @@
 </file>
 
 <file path=word/styles.xml><?xml version="1.0" encoding="utf-8"?>
-<w:styles xmlns:mc="http://schemas.openxmlformats.org/markup-compatibility/2006" xmlns:r="http://schemas.openxmlformats.org/officeDocument/2006/relationships" xmlns:w="http://schemas.openxmlformats.org/wordprocessingml/2006/main" xmlns:w14="http://schemas.microsoft.com/office/word/2010/wordml" xmlns:w15="http://schemas.microsoft.com/office/word/2012/wordml" mc:Ignorable="w14 w15">
+<w:styles xmlns:mc="http://schemas.openxmlformats.org/markup-compatibility/2006" xmlns:r="http://schemas.openxmlformats.org/officeDocument/2006/relationships" xmlns:w="http://schemas.openxmlformats.org/wordprocessingml/2006/main" xmlns:w14="http://schemas.microsoft.com/office/word/2010/wordml" xmlns:w15="http://schemas.microsoft.com/office/word/2012/wordml" xmlns:w16cex="http://schemas.microsoft.com/office/word/2018/wordml/cex" xmlns:w16cid="http://schemas.microsoft.com/office/word/2016/wordml/cid" xmlns:w16="http://schemas.microsoft.com/office/word/2018/wordml" xmlns:w16du="http://schemas.microsoft.com/office/word/2023/wordml/word16du" xmlns:w16sdtdh="http://schemas.microsoft.com/office/word/2020/wordml/sdtdatahash" xmlns:w16sdtfl="http://schemas.microsoft.com/office/word/2024/wordml/sdtformatlock" xmlns:w16se="http://schemas.microsoft.com/office/word/2015/wordml/symex" mc:Ignorable="w14 w15 w16se w16cid w16 w16cex w16sdtdh w16sdtfl w16du">
   <w:docDefaults>
     <w:rPrDefault>
       <w:rPr>
@@ -402,7 +736,7 @@
       </w:pPr>
     </w:pPrDefault>
   </w:docDefaults>
-  <w:latentStyles w:defLockedState="0" w:defUIPriority="99" w:defSemiHidden="0" w:defUnhideWhenUsed="0" w:defQFormat="0" w:count="371">
+  <w:latentStyles w:defLockedState="0" w:defUIPriority="99" w:defSemiHidden="0" w:defUnhideWhenUsed="0" w:defQFormat="0" w:count="376">
     <w:lsdException w:name="Normal" w:uiPriority="0" w:qFormat="1"/>
     <w:lsdException w:name="heading 1" w:uiPriority="9" w:qFormat="1"/>
     <w:lsdException w:name="heading 2" w:semiHidden="1" w:uiPriority="9" w:unhideWhenUsed="1" w:qFormat="1"/>
@@ -774,6 +1108,11 @@
     <w:lsdException w:name="List Table 5 Dark Accent 6" w:uiPriority="50"/>
     <w:lsdException w:name="List Table 6 Colorful Accent 6" w:uiPriority="51"/>
     <w:lsdException w:name="List Table 7 Colorful Accent 6" w:uiPriority="52"/>
+    <w:lsdException w:name="Mention" w:semiHidden="1" w:unhideWhenUsed="1"/>
+    <w:lsdException w:name="Smart Hyperlink" w:semiHidden="1" w:unhideWhenUsed="1"/>
+    <w:lsdException w:name="Hashtag" w:semiHidden="1" w:unhideWhenUsed="1"/>
+    <w:lsdException w:name="Unresolved Mention" w:semiHidden="1" w:unhideWhenUsed="1"/>
+    <w:lsdException w:name="Smart Link" w:semiHidden="1" w:unhideWhenUsed="1"/>
   </w:latentStyles>
   <w:style w:type="paragraph" w:default="1" w:styleId="Normal">
     <w:name w:val="Normal"/>
@@ -782,7 +1121,6 @@
   <w:style w:type="character" w:default="1" w:styleId="DefaultParagraphFont">
     <w:name w:val="Default Paragraph Font"/>
     <w:uiPriority w:val="1"/>
-    <w:semiHidden/>
     <w:unhideWhenUsed/>
   </w:style>
   <w:style w:type="table" w:default="1" w:styleId="TableNormal">

</xml_diff>